<commit_message>
Update: Enlace al repositorio (.docx y .pdf)
</commit_message>
<xml_diff>
--- a/reports/Enlace_Repositorio_GitHub.docx
+++ b/reports/Enlace_Repositorio_GitHub.docx
@@ -95,6 +95,7 @@
           <w:p>
             <w:pPr>
               <w:spacing w:after="100"/>
+              <w:jc w:val="center"/>
             </w:pPr>
             <w:r>
               <w:rPr>
@@ -109,6 +110,7 @@
           <w:p>
             <w:pPr>
               <w:spacing w:after="180"/>
+              <w:jc w:val="center"/>
             </w:pPr>
             <w:r>
               <w:rPr>
@@ -120,6 +122,9 @@
             </w:r>
           </w:p>
           <w:p>
+            <w:pPr>
+              <w:jc w:val="center"/>
+            </w:pPr>
             <w:hyperlink r:id="rId4" w:history="1">
               <w:r>
                 <w:rPr>
@@ -164,6 +169,9 @@
             <w:tcW w:w="0" w:type="auto"/>
           </w:tcPr>
           <w:p>
+            <w:pPr>
+              <w:jc w:val="both"/>
+            </w:pPr>
             <w:r>
               <w:rPr>
                 <w:b/>
@@ -178,14 +186,12 @@
             <w:tcW w:w="0" w:type="auto"/>
           </w:tcPr>
           <w:p>
-            <w:r>
-              <w:t xml:space="preserve">CC3084 — Data </w:t>
-            </w:r>
-            <w:proofErr w:type="spellStart"/>
-            <w:r>
-              <w:t>Science</w:t>
-            </w:r>
-            <w:proofErr w:type="spellEnd"/>
+            <w:pPr>
+              <w:jc w:val="both"/>
+            </w:pPr>
+            <w:r>
+              <w:t>CC3084 — Data Science</w:t>
+            </w:r>
           </w:p>
         </w:tc>
       </w:tr>
@@ -195,6 +201,9 @@
             <w:tcW w:w="0" w:type="auto"/>
           </w:tcPr>
           <w:p>
+            <w:pPr>
+              <w:jc w:val="both"/>
+            </w:pPr>
             <w:r>
               <w:rPr>
                 <w:b/>
@@ -209,8 +218,17 @@
             <w:tcW w:w="0" w:type="auto"/>
           </w:tcPr>
           <w:p>
-            <w:r>
-              <w:t>Avance del Laboratorio 4 — Ejercicios 1 al 4</w:t>
+            <w:pPr>
+              <w:jc w:val="both"/>
+            </w:pPr>
+            <w:r>
+              <w:t>Final</w:t>
+            </w:r>
+            <w:r>
+              <w:t xml:space="preserve"> del Laboratorio 4 — Ejercicios 1 al </w:t>
+            </w:r>
+            <w:r>
+              <w:t>8</w:t>
             </w:r>
           </w:p>
         </w:tc>
@@ -221,6 +239,9 @@
             <w:tcW w:w="0" w:type="auto"/>
           </w:tcPr>
           <w:p>
+            <w:pPr>
+              <w:jc w:val="both"/>
+            </w:pPr>
             <w:r>
               <w:rPr>
                 <w:b/>
@@ -235,6 +256,9 @@
             <w:tcW w:w="0" w:type="auto"/>
           </w:tcPr>
           <w:p>
+            <w:pPr>
+              <w:jc w:val="both"/>
+            </w:pPr>
             <w:r>
               <w:t>Grupo 1</w:t>
             </w:r>
@@ -247,6 +271,9 @@
             <w:tcW w:w="0" w:type="auto"/>
           </w:tcPr>
           <w:p>
+            <w:pPr>
+              <w:jc w:val="both"/>
+            </w:pPr>
             <w:r>
               <w:rPr>
                 <w:b/>
@@ -261,6 +288,9 @@
             <w:tcW w:w="0" w:type="auto"/>
           </w:tcPr>
           <w:p>
+            <w:pPr>
+              <w:jc w:val="both"/>
+            </w:pPr>
             <w:r>
               <w:t>Notebook de Python, código reproducible, resultados, figuras e informe en LaTeX/PDF</w:t>
             </w:r>
@@ -278,7 +308,21 @@
           <w:color w:val="788C95"/>
           <w:sz w:val="18"/>
         </w:rPr>
-        <w:t>Documento de enlace para la entrega académica · 13 de agosto de 2026</w:t>
+        <w:t>Documento de enlace para la entrega académica · 1</w:t>
+      </w:r>
+      <w:r>
+        <w:rPr>
+          <w:color w:val="788C95"/>
+          <w:sz w:val="18"/>
+        </w:rPr>
+        <w:t>6</w:t>
+      </w:r>
+      <w:r>
+        <w:rPr>
+          <w:color w:val="788C95"/>
+          <w:sz w:val="18"/>
+        </w:rPr>
+        <w:t xml:space="preserve"> de agosto de 2026</w:t>
       </w:r>
     </w:p>
     <w:sectPr>

</xml_diff>